<commit_message>
Major update: template matching, EOP image, bug fixes, performance
- Updated all finding texts to match clinical template wording
- Added Skeletal Alignment finding and EOP reference image/checkbox
- Auto-select reference diagrams when conditions are checked
- Updated recommendation texts for thrush, cradle cap, blocked tear duct
- Reference images now insert inline at reference_images placeholder
- Prevent image/caption split across page breaks
- Reduced reference image size, 4-column grid layout
- Remove redundant Normal Tongue Frenulum checkbox
- Fix feeding_formula NameError in submit_data
- Performance: compress images before embedding, background threading
- Save/Load progress feature, build script added

Co-Authored-By: Claude Sonnet 4.6 <noreply@anthropic.com>
</commit_message>
<xml_diff>
--- a/report_template.docx
+++ b/report_template.docx
@@ -968,6 +968,74 @@
         <w:shd w:val="clear" w:color="auto" w:fill="FFFFFF"/>
         <w:spacing w:after="0" w:line="240" w:lineRule="auto"/>
         <w:rPr>
+          <w:sz w:val="20"/>
+          <w:szCs w:val="20"/>
+        </w:rPr>
+      </w:pPr>
+    </w:p>
+    <w:p>
+      <w:pPr>
+        <w:shd w:val="clear" w:color="auto" w:fill="FFFFFF"/>
+        <w:spacing w:after="0" w:line="240" w:lineRule="auto"/>
+        <w:rPr>
+          <w:sz w:val="20"/>
+          <w:szCs w:val="20"/>
+        </w:rPr>
+      </w:pPr>
+      <w:proofErr w:type="gramStart"/>
+      <w:r>
+        <w:rPr>
+          <w:sz w:val="20"/>
+          <w:szCs w:val="20"/>
+        </w:rPr>
+        <w:t xml:space="preserve">{{ </w:t>
+      </w:r>
+      <w:proofErr w:type="spellStart"/>
+      <w:r>
+        <w:rPr>
+          <w:sz w:val="20"/>
+          <w:szCs w:val="20"/>
+        </w:rPr>
+        <w:t>reference</w:t>
+      </w:r>
+      <w:proofErr w:type="gramEnd"/>
+      <w:r>
+        <w:rPr>
+          <w:sz w:val="20"/>
+          <w:szCs w:val="20"/>
+        </w:rPr>
+        <w:t>_</w:t>
+      </w:r>
+      <w:proofErr w:type="gramStart"/>
+      <w:r>
+        <w:rPr>
+          <w:sz w:val="20"/>
+          <w:szCs w:val="20"/>
+        </w:rPr>
+        <w:t>images</w:t>
+      </w:r>
+      <w:proofErr w:type="spellEnd"/>
+      <w:r>
+        <w:rPr>
+          <w:sz w:val="20"/>
+          <w:szCs w:val="20"/>
+        </w:rPr>
+        <w:t xml:space="preserve"> }</w:t>
+      </w:r>
+      <w:proofErr w:type="gramEnd"/>
+      <w:r>
+        <w:rPr>
+          <w:sz w:val="20"/>
+          <w:szCs w:val="20"/>
+        </w:rPr>
+        <w:t>}</w:t>
+      </w:r>
+    </w:p>
+    <w:p>
+      <w:pPr>
+        <w:shd w:val="clear" w:color="auto" w:fill="FFFFFF"/>
+        <w:spacing w:after="0" w:line="240" w:lineRule="auto"/>
+        <w:rPr>
           <w:rFonts w:eastAsia="Times New Roman" w:cstheme="minorHAnsi"/>
           <w:b/>
           <w:bCs/>
@@ -1851,100 +1919,6 @@
           <w:szCs w:val="16"/>
         </w:rPr>
         <w:t>}</w:t>
-      </w:r>
-    </w:p>
-    <w:p>
-      <w:pPr>
-        <w:pStyle w:val="NoSpacing"/>
-        <w:rPr>
-          <w:b/>
-          <w:bCs/>
-          <w:color w:val="222222"/>
-          <w:sz w:val="16"/>
-          <w:szCs w:val="16"/>
-          <w:u w:val="single"/>
-        </w:rPr>
-      </w:pPr>
-    </w:p>
-    <w:p>
-      <w:pPr>
-        <w:pStyle w:val="NoSpacing"/>
-        <w:rPr>
-          <w:color w:val="222222"/>
-          <w:sz w:val="16"/>
-          <w:szCs w:val="16"/>
-        </w:rPr>
-      </w:pPr>
-      <w:r>
-        <w:rPr>
-          <w:b/>
-          <w:bCs/>
-          <w:color w:val="222222"/>
-          <w:sz w:val="16"/>
-          <w:szCs w:val="16"/>
-          <w:u w:val="single"/>
-        </w:rPr>
-        <w:t>T</w:t>
-      </w:r>
-      <w:r>
-        <w:rPr>
-          <w:b/>
-          <w:bCs/>
-          <w:color w:val="222222"/>
-          <w:sz w:val="16"/>
-          <w:szCs w:val="16"/>
-          <w:u w:val="single"/>
-        </w:rPr>
-        <w:t xml:space="preserve">he </w:t>
-      </w:r>
-      <w:r>
-        <w:rPr>
-          <w:b/>
-          <w:bCs/>
-          <w:color w:val="222222"/>
-          <w:sz w:val="16"/>
-          <w:szCs w:val="16"/>
-          <w:u w:val="single"/>
-        </w:rPr>
-        <w:t>D</w:t>
-      </w:r>
-      <w:r>
-        <w:rPr>
-          <w:b/>
-          <w:bCs/>
-          <w:color w:val="222222"/>
-          <w:sz w:val="16"/>
-          <w:szCs w:val="16"/>
-          <w:u w:val="single"/>
-        </w:rPr>
-        <w:t>iagram</w:t>
-      </w:r>
-      <w:r>
-        <w:rPr>
-          <w:b/>
-          <w:bCs/>
-          <w:color w:val="222222"/>
-          <w:sz w:val="16"/>
-          <w:szCs w:val="16"/>
-          <w:u w:val="single"/>
-        </w:rPr>
-        <w:t xml:space="preserve"> </w:t>
-      </w:r>
-      <w:r>
-        <w:rPr>
-          <w:color w:val="222222"/>
-          <w:sz w:val="16"/>
-          <w:szCs w:val="16"/>
-        </w:rPr>
-        <w:t>demonstrates</w:t>
-      </w:r>
-      <w:r>
-        <w:rPr>
-          <w:color w:val="222222"/>
-          <w:sz w:val="16"/>
-          <w:szCs w:val="16"/>
-        </w:rPr>
-        <w:t>.</w:t>
       </w:r>
     </w:p>
     <w:p>

</xml_diff>